<commit_message>
Add Python 3.14 and typechecking migration projects. (#29)
Add Python 3.14 and typechecking migration projects. (#29)
</commit_message>
<xml_diff>
--- a/Kaleb_Coberly_resume.docx
+++ b/Kaleb_Coberly_resume.docx
@@ -833,20 +833,156 @@
         <w:pStyle w:val="ListBullet"/>
       </w:pPr>
       <w:r>
-        <w:t>Implemented and maintaining reusable GitHub Actions CI/CD pipelines and dev flows with automated testing and QE for local + Docker development and open-source Python package releases.</w:t>
+        <w:t>Built</w:t>
+      </w:r>
+      <w:r>
+        <w:t xml:space="preserve"> and </w:t>
+      </w:r>
+      <w:r>
+        <w:t>maintain</w:t>
+      </w:r>
+      <w:r>
+        <w:t xml:space="preserve"> reusable GitHub Actions CI/CD pipelines and dev flows with automated testing and QE for local + Docker development and open-source Python package releases</w:t>
+      </w:r>
+      <w:r>
+        <w:t xml:space="preserve">, </w:t>
+      </w:r>
+      <w:hyperlink r:id="rId13" w:history="1">
+        <w:r>
+          <w:rPr>
+            <w:rStyle w:val="Hyperlink"/>
+          </w:rPr>
+          <w:t>github.com/crick</w:t>
+        </w:r>
+        <w:r>
+          <w:rPr>
+            <w:rStyle w:val="Hyperlink"/>
+          </w:rPr>
+          <w:t>e</w:t>
+        </w:r>
+        <w:r>
+          <w:rPr>
+            <w:rStyle w:val="Hyperlink"/>
+          </w:rPr>
+          <w:t>ts-and-comb/shared</w:t>
+        </w:r>
+      </w:hyperlink>
+      <w:r>
+        <w:t>.</w:t>
       </w:r>
     </w:p>
     <w:p>
       <w:pPr>
         <w:pStyle w:val="ListBullet"/>
-      </w:pPr>
-      <w:r>
-        <w:t>Onboard developers by using documentation, presentations, and hands-on support of testing conventions, CI steps, and Git Flow.</w:t>
+        <w:tabs>
+          <w:tab w:val="clear" w:pos="360"/>
+          <w:tab w:val="num" w:pos="720"/>
+        </w:tabs>
+        <w:ind w:left="720"/>
+      </w:pPr>
+      <w:r>
+        <w:t>Maintain Python version and package support window.</w:t>
       </w:r>
     </w:p>
     <w:p>
       <w:pPr>
         <w:pStyle w:val="ListBullet"/>
+        <w:tabs>
+          <w:tab w:val="clear" w:pos="360"/>
+          <w:tab w:val="num" w:pos="720"/>
+        </w:tabs>
+        <w:ind w:left="720"/>
+      </w:pPr>
+      <w:r>
+        <w:t>Led AI agent in migrating package suite and central tools from `</w:t>
+      </w:r>
+      <w:proofErr w:type="spellStart"/>
+      <w:r>
+        <w:t>pytype</w:t>
+      </w:r>
+      <w:proofErr w:type="spellEnd"/>
+      <w:r>
+        <w:t>` to `</w:t>
+      </w:r>
+      <w:proofErr w:type="spellStart"/>
+      <w:r>
+        <w:t>mypy</w:t>
+      </w:r>
+      <w:proofErr w:type="spellEnd"/>
+      <w:r>
+        <w:t xml:space="preserve">`: </w:t>
+      </w:r>
+      <w:hyperlink r:id="rId14" w:history="1">
+        <w:r>
+          <w:rPr>
+            <w:rStyle w:val="Hyperlink"/>
+          </w:rPr>
+          <w:t>github.com/orgs/cricket</w:t>
+        </w:r>
+        <w:r>
+          <w:rPr>
+            <w:rStyle w:val="Hyperlink"/>
+          </w:rPr>
+          <w:t>s</w:t>
+        </w:r>
+        <w:r>
+          <w:rPr>
+            <w:rStyle w:val="Hyperlink"/>
+          </w:rPr>
+          <w:t>-and-comb/projects/3</w:t>
+        </w:r>
+      </w:hyperlink>
+      <w:r>
+        <w:t>.</w:t>
+      </w:r>
+    </w:p>
+    <w:p>
+      <w:pPr>
+        <w:pStyle w:val="ListBullet"/>
+        <w:tabs>
+          <w:tab w:val="clear" w:pos="360"/>
+          <w:tab w:val="num" w:pos="720"/>
+        </w:tabs>
+        <w:ind w:left="720"/>
+      </w:pPr>
+      <w:r>
+        <w:t xml:space="preserve">Migrated package suite to Python 3.14 compatibility: </w:t>
+      </w:r>
+      <w:hyperlink r:id="rId15" w:history="1">
+        <w:r>
+          <w:rPr>
+            <w:rStyle w:val="Hyperlink"/>
+          </w:rPr>
+          <w:t>github.com/crickets-and-com</w:t>
+        </w:r>
+        <w:r>
+          <w:rPr>
+            <w:rStyle w:val="Hyperlink"/>
+          </w:rPr>
+          <w:t>b</w:t>
+        </w:r>
+        <w:r>
+          <w:rPr>
+            <w:rStyle w:val="Hyperlink"/>
+          </w:rPr>
+          <w:t>/shared/issues/108</w:t>
+        </w:r>
+      </w:hyperlink>
+      <w:r>
+        <w:t>.</w:t>
+      </w:r>
+    </w:p>
+    <w:p>
+      <w:pPr>
+        <w:pStyle w:val="ListBullet"/>
+      </w:pPr>
+      <w:r>
+        <w:t>Onboard developers by using documentation, presentations, and hands-on support of testing conventions, CI steps, and Git Flow.</w:t>
+      </w:r>
+    </w:p>
+    <w:p>
+      <w:pPr>
+        <w:pStyle w:val="ListBullet"/>
       </w:pPr>
       <w:r>
         <w:t>Automated part of</w:t>
@@ -884,6 +1020,37 @@
       <w:r>
         <w:t>, reducing several staff-hours with each weekly use</w:t>
       </w:r>
+      <w:r>
+        <w:t xml:space="preserve">, </w:t>
+      </w:r>
+      <w:hyperlink r:id="rId16" w:history="1">
+        <w:r>
+          <w:rPr>
+            <w:rStyle w:val="Hyperlink"/>
+          </w:rPr>
+          <w:t>github.com/crickets-and-com</w:t>
+        </w:r>
+        <w:r>
+          <w:rPr>
+            <w:rStyle w:val="Hyperlink"/>
+          </w:rPr>
+          <w:t>b</w:t>
+        </w:r>
+        <w:r>
+          <w:rPr>
+            <w:rStyle w:val="Hyperlink"/>
+          </w:rPr>
+          <w:t>/</w:t>
+        </w:r>
+        <w:proofErr w:type="spellStart"/>
+        <w:r>
+          <w:rPr>
+            <w:rStyle w:val="Hyperlink"/>
+          </w:rPr>
+          <w:t>bfb_delivery</w:t>
+        </w:r>
+        <w:proofErr w:type="spellEnd"/>
+      </w:hyperlink>
       <w:r>
         <w:t>:</w:t>
       </w:r>
@@ -1982,7 +2149,6 @@
   <w:style w:type="character" w:default="1" w:styleId="DefaultParagraphFont">
     <w:name w:val="Default Paragraph Font"/>
     <w:uiPriority w:val="1"/>
-    <w:semiHidden/>
     <w:unhideWhenUsed/>
   </w:style>
   <w:style w:type="table" w:default="1" w:styleId="TableNormal">

</xml_diff>